<commit_message>
Deploying to gh-pages from @ Morrison-Lab/pr.helpers@0e055064d92189030d03698e60ac185372f51d9f 🚀
</commit_message>
<xml_diff>
--- a/vignettes/articles/quarto_article.docx
+++ b/vignettes/articles/quarto_article.docx
@@ -23,7 +23,7 @@
         <w:pStyle w:val="Date"/>
       </w:pPr>
       <w:r>
-        <w:t xml:space="preserve">2026-04-23</w:t>
+        <w:t xml:space="preserve">2026-10-19</w:t>
       </w:r>
     </w:p>
     <w:p>
@@ -2221,7 +2221,7 @@
         <w:rPr>
           <w:rStyle w:val="VerbatimChar"/>
         </w:rPr>
-        <w:t xml:space="preserve">#&gt;        id           group               value1           value2     </w:t>
+        <w:t xml:space="preserve">#&gt;        id              group        value1           value2     </w:t>
       </w:r>
       <w:r>
         <w:br/>
@@ -2230,7 +2230,7 @@
         <w:rPr>
           <w:rStyle w:val="VerbatimChar"/>
         </w:rPr>
-        <w:t xml:space="preserve">#&gt;  Min.   : 1.00   Length:50          Min.   : 79.60   Min.   :32.43  </w:t>
+        <w:t xml:space="preserve">#&gt;  Min.   : 1.00   Length   :50   Min.   : 79.60   Min.   :32.43  </w:t>
       </w:r>
       <w:r>
         <w:br/>
@@ -2239,7 +2239,7 @@
         <w:rPr>
           <w:rStyle w:val="VerbatimChar"/>
         </w:rPr>
-        <w:t xml:space="preserve">#&gt;  1st Qu.:13.25   Class :character   1st Qu.: 89.29   1st Qu.:46.76  </w:t>
+        <w:t xml:space="preserve">#&gt;  1st Qu.:13.25   N.unique : 2   1st Qu.: 89.29   1st Qu.:46.76  </w:t>
       </w:r>
       <w:r>
         <w:br/>
@@ -2248,7 +2248,7 @@
         <w:rPr>
           <w:rStyle w:val="VerbatimChar"/>
         </w:rPr>
-        <w:t xml:space="preserve">#&gt;  Median :25.50   Mode  :character   Median : 96.64   Median :51.04  </w:t>
+        <w:t xml:space="preserve">#&gt;  Median :25.50   N.blank  : 0   Median : 96.64   Median :51.04  </w:t>
       </w:r>
       <w:r>
         <w:br/>
@@ -2257,7 +2257,7 @@
         <w:rPr>
           <w:rStyle w:val="VerbatimChar"/>
         </w:rPr>
-        <w:t xml:space="preserve">#&gt;  Mean   :25.50                      Mean   : 99.87   Mean   :52.49  </w:t>
+        <w:t xml:space="preserve">#&gt;  Mean   :25.50   Min.nchar: 1   Mean   : 99.87   Mean   :52.49  </w:t>
       </w:r>
       <w:r>
         <w:br/>
@@ -2266,7 +2266,7 @@
         <w:rPr>
           <w:rStyle w:val="VerbatimChar"/>
         </w:rPr>
-        <w:t xml:space="preserve">#&gt;  3rd Qu.:37.75                      3rd Qu.:107.93   3rd Qu.:59.34  </w:t>
+        <w:t xml:space="preserve">#&gt;  3rd Qu.:37.75   Max.nchar: 1   3rd Qu.:107.93   3rd Qu.:59.34  </w:t>
       </w:r>
       <w:r>
         <w:br/>
@@ -2275,7 +2275,7 @@
         <w:rPr>
           <w:rStyle w:val="VerbatimChar"/>
         </w:rPr>
-        <w:t xml:space="preserve">#&gt;  Max.   :50.00                      Max.   :132.98   Max.   :72.93</w:t>
+        <w:t xml:space="preserve">#&gt;  Max.   :50.00                  Max.   :132.98   Max.   :72.93</w:t>
       </w:r>
     </w:p>
     <w:p>

</xml_diff>